<commit_message>
Sync P9 Word/PDF manuscript with main.tex: add SATD subsection
Resync the docx/pdf build (generated from a hand-written spec, not
auto-parsed from main.tex) to match content added to main.tex since
the last sync: a new Results subsection on self-admitted technical
debt (SATD comment density, 42.2% vs 23.0% of repos), the matching
abstract/conclusion/limitations sentences, the GitHub fork-exclusion
verification note in Methodology, two new Limitations citations
(Kalliamvakou et al. 2014, Munaiah et al. 2017) on GitHub-mining
sample-quality risks, and a correction to the code-smell-direction
sentence (unnamed default packages actually favor the control group).
</commit_message>
<xml_diff>
--- a/paper/P9_CLEIej_manuscript.docx
+++ b/paper/P9_CLEIej_manuscript.docx
@@ -78,7 +78,45 @@
           <w:sz w:val="22"/>
           <w:szCs w:val="22"/>
         </w:rPr>
-        <w:t xml:space="preserve"> SonarQube-native technical debt ratio (δ = −0.142, p = 0.025) — consistent with, not contradicting, the lower-complexity result.</w:t>
+        <w:t xml:space="preserve"> SonarQube-native technical debt ratio (δ = −0.142, p = 0.025) — consistent with, not contradicting, the lower-complexity result. On the same sub-sample, a self-admitted technical debt (SATD) comment count (</w:t>
+      </w:r>
+      <w:r>
+        <w:rPr>
+          <w:rFonts w:ascii="Courier New" w:cs="Courier New" w:eastAsia="Courier New" w:hAnsi="Courier New"/>
+          <w:i w:val="false"/>
+          <w:iCs w:val="false"/>
+          <w:sz w:val="22"/>
+          <w:szCs w:val="22"/>
+        </w:rPr>
+        <w:t xml:space="preserve">TODO</w:t>
+      </w:r>
+      <w:r>
+        <w:rPr>
+          <w:i w:val="false"/>
+          <w:iCs w:val="false"/>
+          <w:sz w:val="22"/>
+          <w:szCs w:val="22"/>
+        </w:rPr>
+        <w:t xml:space="preserve">/</w:t>
+      </w:r>
+      <w:r>
+        <w:rPr>
+          <w:rFonts w:ascii="Courier New" w:cs="Courier New" w:eastAsia="Courier New" w:hAnsi="Courier New"/>
+          <w:i w:val="false"/>
+          <w:iCs w:val="false"/>
+          <w:sz w:val="22"/>
+          <w:szCs w:val="22"/>
+        </w:rPr>
+        <w:t xml:space="preserve">FIXME</w:t>
+      </w:r>
+      <w:r>
+        <w:rPr>
+          <w:i w:val="false"/>
+          <w:iCs w:val="false"/>
+          <w:sz w:val="22"/>
+          <w:szCs w:val="22"/>
+        </w:rPr>
+        <w:t xml:space="preserve">-style markers) runs in the direction the original hypothesis expected: academic repositories more often contain at least one such marker than control repositories do (42.2% vs. 23.0%, Cliff's δ = +0.190, p &lt; 0.001), even though the underlying code is structurally simpler.</w:t>
       </w:r>
     </w:p>
     <w:p>
@@ -235,7 +273,37 @@
           <w:sz w:val="22"/>
           <w:szCs w:val="22"/>
         </w:rPr>
-        <w:t xml:space="preserve">, and related terms) combined with a language filter (Java, Python, JavaScript) and a minimum size threshold, then verified by checking whether at least one of the repository's top contributors declares a Latin American city or country in their public GitHub profile location field. This combined keyword-plus-location approach is a heuristic, not a ground-truth label, and is discussed as a limitation below. Repositories with fewer than 10 commits were excluded. From 5,418 unique keyword-matched candidates, 300 were accepted as academic (274 successfully cloned and analyzed; the remainder had since been deleted, renamed, or were otherwise unreachable). A control sample of 300 non-academic repositories was drawn by querying GitHub for repositories in the same three languages within a size band matched to the academic sample (275 successfully analyzed) — explicitly </w:t>
+        <w:t xml:space="preserve">, and related terms) combined with a language filter (Java, Python, JavaScript) and a minimum size threshold, then verified by checking whether at least one of the repository's top contributors declares a Latin American city or country in their public GitHub profile location field. This combined keyword-plus-location approach is a heuristic, not a ground-truth label, and is discussed as a limitation below. Repositories with fewer than 10 commits were excluded. The GitHub search API excludes forked repositories by default unless a </w:t>
+      </w:r>
+      <w:r>
+        <w:rPr>
+          <w:rFonts w:ascii="Courier New" w:cs="Courier New" w:eastAsia="Courier New" w:hAnsi="Courier New"/>
+          <w:sz w:val="22"/>
+          <w:szCs w:val="22"/>
+        </w:rPr>
+        <w:t xml:space="preserve">fork:</w:t>
+      </w:r>
+      <w:r>
+        <w:rPr>
+          <w:sz w:val="22"/>
+          <w:szCs w:val="22"/>
+        </w:rPr>
+        <w:t xml:space="preserve"> qualifier is explicitly added, and none of our queries added one; we verified this directly by re-issuing representative academic- and control-sample queries and confirming </w:t>
+      </w:r>
+      <w:r>
+        <w:rPr>
+          <w:rFonts w:ascii="Courier New" w:cs="Courier New" w:eastAsia="Courier New" w:hAnsi="Courier New"/>
+          <w:sz w:val="22"/>
+          <w:szCs w:val="22"/>
+        </w:rPr>
+        <w:t xml:space="preserve">fork=false</w:t>
+      </w:r>
+      <w:r>
+        <w:rPr>
+          <w:sz w:val="22"/>
+          <w:szCs w:val="22"/>
+        </w:rPr>
+        <w:t xml:space="preserve"> for every returned repository, so the sample does not require a separate fork-filtering step. From 5,418 unique keyword-matched candidates, 300 were accepted as academic (274 successfully cloned and analyzed; the remainder had since been deleted, renamed, or were otherwise unreachable). A control sample of 300 non-academic repositories was drawn by querying GitHub for repositories in the same three languages within a size band matched to the academic sample (275 successfully analyzed) — explicitly </w:t>
       </w:r>
       <w:r>
         <w:rPr>
@@ -2331,7 +2399,21 @@
           <w:sz w:val="22"/>
           <w:szCs w:val="22"/>
         </w:rPr>
-        <w:t xml:space="preserve">Figure 4 shows the ten most frequent SonarQube code-smell types, split by group. The single most common smell in both groups is a JavaScript/React-specific rule (prop-types validation), reflecting the language mix of the sample rather than an academic-specific pattern; academic code shows a markedly higher rate of style-convention smells (unnamed default packages, let/const usage, package-naming convention), consistent with less mature project tooling and linting setup rather than with deeper structural problems.</w:t>
+        <w:t xml:space="preserve">Figure 4 shows the ten most frequent SonarQube code-smell types, split by group. The single most common smell in both groups is a JavaScript/React-specific rule (prop-types validation), reflecting the language mix of the sample rather than an academic-specific pattern; academic code shows a markedly higher rate of two style-convention smells (let/const usage, package-naming convention), consistent with less mature project tooling and linting setup rather than with deeper structural problems. Not every smell in Figure 4 follows this direction, though: the default-unnamed-package smell (Java), also among the ten most frequent, is far more common in the </w:t>
+      </w:r>
+      <w:r>
+        <w:rPr>
+          <w:sz w:val="22"/>
+          <w:szCs w:val="22"/>
+        </w:rPr>
+        <w:t xml:space="preserve">control</w:t>
+      </w:r>
+      <w:r>
+        <w:rPr>
+          <w:sz w:val="22"/>
+          <w:szCs w:val="22"/>
+        </w:rPr>
+        <w:t xml:space="preserve"> group (2,343 vs. 114 occurrences), the opposite of the general style-convention pattern, so we do not read the academic/control split as uniform across all ten smell types.</w:t>
       </w:r>
     </w:p>
     <w:p>
@@ -2398,6 +2480,119 @@
     </w:p>
     <w:p>
       <w:pPr>
+        <w:spacing w:after="200"/>
+      </w:pPr>
+      <w:r>
+        <w:rPr>
+          <w:sz w:val="24"/>
+          <w:szCs w:val="24"/>
+        </w:rPr>
+        <w:t xml:space="preserve">Self-admitted technical debt</w:t>
+      </w:r>
+    </w:p>
+    <w:p>
+      <w:pPr>
+        <w:spacing w:after="200"/>
+      </w:pPr>
+      <w:r>
+        <w:rPr>
+          <w:sz w:val="22"/>
+          <w:szCs w:val="22"/>
+        </w:rPr>
+        <w:t xml:space="preserve">As a complement to the structural metrics above, we scanned source comments in the same 415-repository SonarQube sub-sample for self-admitted technical debt (SATD) markers (</w:t>
+      </w:r>
+      <w:r>
+        <w:rPr>
+          <w:rFonts w:ascii="Courier New" w:cs="Courier New" w:eastAsia="Courier New" w:hAnsi="Courier New"/>
+          <w:sz w:val="22"/>
+          <w:szCs w:val="22"/>
+        </w:rPr>
+        <w:t xml:space="preserve">TODO</w:t>
+      </w:r>
+      <w:r>
+        <w:rPr>
+          <w:sz w:val="22"/>
+          <w:szCs w:val="22"/>
+        </w:rPr>
+        <w:t xml:space="preserve">, </w:t>
+      </w:r>
+      <w:r>
+        <w:rPr>
+          <w:rFonts w:ascii="Courier New" w:cs="Courier New" w:eastAsia="Courier New" w:hAnsi="Courier New"/>
+          <w:sz w:val="22"/>
+          <w:szCs w:val="22"/>
+        </w:rPr>
+        <w:t xml:space="preserve">FIXME</w:t>
+      </w:r>
+      <w:r>
+        <w:rPr>
+          <w:sz w:val="22"/>
+          <w:szCs w:val="22"/>
+        </w:rPr>
+        <w:t xml:space="preserve">, </w:t>
+      </w:r>
+      <w:r>
+        <w:rPr>
+          <w:rFonts w:ascii="Courier New" w:cs="Courier New" w:eastAsia="Courier New" w:hAnsi="Courier New"/>
+          <w:sz w:val="22"/>
+          <w:szCs w:val="22"/>
+        </w:rPr>
+        <w:t xml:space="preserve">HACK</w:t>
+      </w:r>
+      <w:r>
+        <w:rPr>
+          <w:sz w:val="22"/>
+          <w:szCs w:val="22"/>
+        </w:rPr>
+        <w:t xml:space="preserve">, </w:t>
+      </w:r>
+      <w:r>
+        <w:rPr>
+          <w:rFonts w:ascii="Courier New" w:cs="Courier New" w:eastAsia="Courier New" w:hAnsi="Courier New"/>
+          <w:sz w:val="22"/>
+          <w:szCs w:val="22"/>
+        </w:rPr>
+        <w:t xml:space="preserve">XXX</w:t>
+      </w:r>
+      <w:r>
+        <w:rPr>
+          <w:sz w:val="22"/>
+          <w:szCs w:val="22"/>
+        </w:rPr>
+        <w:t xml:space="preserve">, </w:t>
+      </w:r>
+      <w:r>
+        <w:rPr>
+          <w:rFonts w:ascii="Courier New" w:cs="Courier New" w:eastAsia="Courier New" w:hAnsi="Courier New"/>
+          <w:sz w:val="22"/>
+          <w:szCs w:val="22"/>
+        </w:rPr>
+        <w:t xml:space="preserve">BUG</w:t>
+      </w:r>
+      <w:r>
+        <w:rPr>
+          <w:sz w:val="22"/>
+          <w:szCs w:val="22"/>
+        </w:rPr>
+        <w:t xml:space="preserve">, and literal mentions of “technical debt”), normalized per 1,000 lines of code. The median is zero in both groups (most repositories, academic and control alike, contain no SATD marker at all), but the distributions differ: a significantly larger share of academic repositories contain at least one SATD comment (42.2% vs. 23.0%), and academic repositories rank higher overall on this measure (Mann-Whitney U = 25,349.5, p &lt; 0.001, Cliff's δ = +0.190, small effect; IQR 0.00–0.52 academic vs. 0.00–0.00 control). This is driven by typicality rather than extremes: mean SATD density is actually higher in the control group (1.20 vs. 0.65 per 1,000 lines), because a handful of control repositories carry extreme outlier values (up to 120.9 per 1,000 lines) that Cliff's delta, an ordinal measure, is not sensitive to. Unlike the complexity result, this SATD finding runs </w:t>
+      </w:r>
+      <w:r>
+        <w:rPr>
+          <w:sz w:val="22"/>
+          <w:szCs w:val="22"/>
+        </w:rPr>
+        <w:t xml:space="preserve">with</w:t>
+      </w:r>
+      <w:r>
+        <w:rPr>
+          <w:sz w:val="22"/>
+          <w:szCs w:val="22"/>
+        </w:rPr>
+        <w:t xml:space="preserve"> the original hypothesis: academic developers more often leave explicit, self-admitted markers of incomplete or provisional work in their code than the control group does, even though the code that remains is structurally simpler by the metrics above.</w:t>
+      </w:r>
+    </w:p>
+    <w:p>
+      <w:pPr>
         <w:pStyle w:val="Heading1"/>
         <w:spacing w:after="150" w:before="300"/>
       </w:pPr>
@@ -2600,7 +2795,7 @@
           <w:sz w:val="22"/>
           <w:szCs w:val="22"/>
         </w:rPr>
-        <w:t xml:space="preserve">The keyword-plus-contributor-location heuristic used to identify academic repositories is imperfect and can admit false positives (a repository containing the word “tesis” in an unrelated context) or miss true academic repositories that do not use any of the searched terms; we did not attempt manual verification at scale. The heuristic also identifies only GitHub repositories, excluding GitLab, institutional repositories, and any academic work never pushed to a public host at all — a substantial and likely non-random exclusion, since the most informal, least-polished student work is probably the least likely to be published publicly in the first place. As discussed above, the control group's size-matching means it should not be read as representative of professional software in general. Test coverage is a naming-convention proxy, not measured execution coverage. </w:t>
+        <w:t xml:space="preserve">The keyword-plus-contributor-location heuristic used to identify academic repositories is imperfect and can admit false positives (a repository containing the word “tesis” in an unrelated context) or miss true academic repositories that do not use any of the searched terms; we did not attempt manual verification at scale. More generally, GitHub-mining studies are known to over-represent personal, inactive, and non-engineered projects unless explicitly filtered (Kalliamvakou et al., 2014; Munaiah et al., 2017); our size threshold, minimum-commit filter, and (for the academic sample) contributor-location verification each narrow the sample somewhat in this direction, but we did not apply a dedicated engineered-project classifier, so some informal or abandoned repositories likely remain in both groups. The heuristic also identifies only GitHub repositories, excluding GitLab, institutional repositories, and any academic work never pushed to a public host at all — a substantial and likely non-random exclusion, since the most informal, least-polished student work is probably the least likely to be published publicly in the first place. As discussed above, the control group's size-matching means it should not be read as representative of professional software in general. Test coverage is a naming-convention proxy, not measured execution coverage. </w:t>
       </w:r>
       <w:r>
         <w:rPr>
@@ -2630,7 +2825,22 @@
           <w:sz w:val="22"/>
           <w:szCs w:val="22"/>
         </w:rPr>
-        <w:t xml:space="preserve"> and the code-smell-type facets are SonarQube's default rule profile (“Sonar way”), not a profile tuned for either language mix or academic code specifically, and a different quality profile could shift the exact smell-type ranking in Figure 4 without necessarily changing the aggregate complexity and debt-ratio results.</w:t>
+        <w:t xml:space="preserve"> and the code-smell-type facets are SonarQube's default rule profile (“Sonar way”), not a profile tuned for either language mix or academic code specifically, and a different quality profile could shift the exact smell-type ranking in Figure 4 without necessarily changing the aggregate complexity and debt-ratio results. The self-admitted technical debt (SATD) measure is a simple keyword count over source comments, not a validated SATD classifier; it covers only the 415-repository SonarQube sub-sample (not the full 549-repository primary sample, for the same disk-space reason discussed above), and it does not distinguish a genuine debt marker from an unrelated use of a common word (e.g. </w:t>
+      </w:r>
+      <w:r>
+        <w:rPr>
+          <w:rFonts w:ascii="Courier New" w:cs="Courier New" w:eastAsia="Courier New" w:hAnsi="Courier New"/>
+          <w:sz w:val="22"/>
+          <w:szCs w:val="22"/>
+        </w:rPr>
+        <w:t xml:space="preserve">BUG</w:t>
+      </w:r>
+      <w:r>
+        <w:rPr>
+          <w:sz w:val="22"/>
+          <w:szCs w:val="22"/>
+        </w:rPr>
+        <w:t xml:space="preserve"> inside an unrelated identifier or string), so the reported counts should be read as a coarse proxy rather than a precise measurement.</w:t>
       </w:r>
     </w:p>
     <w:p>
@@ -2665,7 +2875,37 @@
           <w:sz w:val="22"/>
           <w:szCs w:val="22"/>
         </w:rPr>
-        <w:t xml:space="preserve"> cyclomatic complexity than the control group — the opposite of our initial hypothesis — while showing significantly deeper inheritance hierarchies, as hypothesized. Coupling, cohesion, duplication, and a test-coverage proxy show no significant difference after correction, and testing is near-absent in both groups rather than distinctively academic. We attribute the inverted complexity result chiefly to the composition of the size-matched control group, which is itself drawn from small, often informal repositories rather than mature open-source software, and recommend that future comparative studies of academic code quality either use a professionally curated control set or explicitly frame their comparison as academic-versus-small-repository rather than academic-versus-professional. A follow-up robustness check with SonarQube Community itself — run without Docker on a 415-repository sub-sample after our original tool substitution — independently reproduces the lower-complexity finding and shows academic code has a lower SonarQube technical-debt ratio, strengthening rather than qualifying the central result; the one point of disagreement across tools, duplication rate, is reported as an open, tool-dependent discrepancy rather than resolved in either direction.</w:t>
+        <w:t xml:space="preserve"> cyclomatic complexity than the control group — the opposite of our initial hypothesis — while showing significantly deeper inheritance hierarchies, as hypothesized. Coupling, cohesion, duplication, and a test-coverage proxy show no significant difference after correction, and testing is near-absent in both groups rather than distinctively academic. We attribute the inverted complexity result chiefly to the composition of the size-matched control group, which is itself drawn from small, often informal repositories rather than mature open-source software, and recommend that future comparative studies of academic code quality either use a professionally curated control set or explicitly frame their comparison as academic-versus-small-repository rather than academic-versus-professional. A follow-up robustness check with SonarQube Community itself — run without Docker on a 415-repository sub-sample after our original tool substitution — independently reproduces the lower-complexity finding and shows academic code has a lower SonarQube technical-debt ratio, strengthening rather than qualifying the central result; the one point of disagreement across tools, duplication rate, is reported as an open, tool-dependent discrepancy rather than resolved in either direction. On the same sub-sample, a self-admitted technical debt (SATD) comment count runs in the direction the original hypothesis expected, unlike the structural metrics: academic repositories more often contain explicit </w:t>
+      </w:r>
+      <w:r>
+        <w:rPr>
+          <w:rFonts w:ascii="Courier New" w:cs="Courier New" w:eastAsia="Courier New" w:hAnsi="Courier New"/>
+          <w:sz w:val="22"/>
+          <w:szCs w:val="22"/>
+        </w:rPr>
+        <w:t xml:space="preserve">TODO</w:t>
+      </w:r>
+      <w:r>
+        <w:rPr>
+          <w:sz w:val="22"/>
+          <w:szCs w:val="22"/>
+        </w:rPr>
+        <w:t xml:space="preserve">/</w:t>
+      </w:r>
+      <w:r>
+        <w:rPr>
+          <w:rFonts w:ascii="Courier New" w:cs="Courier New" w:eastAsia="Courier New" w:hAnsi="Courier New"/>
+          <w:sz w:val="22"/>
+          <w:szCs w:val="22"/>
+        </w:rPr>
+        <w:t xml:space="preserve">FIXME</w:t>
+      </w:r>
+      <w:r>
+        <w:rPr>
+          <w:sz w:val="22"/>
+          <w:szCs w:val="22"/>
+        </w:rPr>
+        <w:t xml:space="preserve">-style markers of unfinished work (Cliff's δ = +0.190, p &lt; 0.001), even though the structural complexity of that code is lower.</w:t>
       </w:r>
     </w:p>
     <w:p>
@@ -2775,7 +3015,33 @@
           <w:sz w:val="20"/>
           <w:szCs w:val="20"/>
         </w:rPr>
+        <w:t xml:space="preserve">Kalliamvakou, E., Gousios, G., Blincoe, K., Singer, L., German, D. M., &amp; Damian, D. (2014). The Promises and Perils of Mining GitHub. Proceedings of the 11th Working Conference on Mining Software Repositories (MSR), 92–101. https://doi.org/10.1145/2597073.2597074</w:t>
+      </w:r>
+    </w:p>
+    <w:p>
+      <w:pPr>
+        <w:spacing w:after="150"/>
+        <w:ind w:left="400" w:hanging="400"/>
+      </w:pPr>
+      <w:r>
+        <w:rPr>
+          <w:sz w:val="20"/>
+          <w:szCs w:val="20"/>
+        </w:rPr>
         <w:t xml:space="preserve">McCabe, T. J. (1976). A Complexity Measure. IEEE Transactions on Software Engineering, SE-2(4), 308–320.</w:t>
+      </w:r>
+    </w:p>
+    <w:p>
+      <w:pPr>
+        <w:spacing w:after="150"/>
+        <w:ind w:left="400" w:hanging="400"/>
+      </w:pPr>
+      <w:r>
+        <w:rPr>
+          <w:sz w:val="20"/>
+          <w:szCs w:val="20"/>
+        </w:rPr>
+        <w:t xml:space="preserve">Munaiah, N., Kroh, S., Cabrey, C., &amp; Nagappan, M. (2017). Curating GitHub for Engineered Software Projects. Empirical Software Engineering, 22(6), 3219–3253. https://doi.org/10.1007/s10664-017-9512-6</w:t>
       </w:r>
     </w:p>
     <w:p>

</xml_diff>

<commit_message>
Update P9 Word/PDF manuscript to IEEE numbered citation style
Matches main.tex's switch from natbib author-year to numbers mode +
ieeetr: in-text citations now render as [N] per first-appearance
order, and the bibliography is resequenced 1-9 (numeric) with [N]
prefixes instead of alphabetical author-year entries.
</commit_message>
<xml_diff>
--- a/paper/P9_CLEIej_manuscript.docx
+++ b/paper/P9_CLEIej_manuscript.docx
@@ -137,7 +137,7 @@
           <w:sz w:val="22"/>
           <w:szCs w:val="22"/>
         </w:rPr>
-        <w:t xml:space="preserve">Software engineering education research and common practitioner belief both assume that code written for a course assignment or a thesis project carries more technical debt (Cunningham, 1992) — higher complexity, near-zero test coverage, more duplicated code — than comparable work produced outside an academic setting. This assumption motivates a large share of software-engineering curriculum design, yet it is rarely tested with a matched, quantitative comparison, and to our knowledge no such comparison has been run specifically for Latin American academic software, where institutional resourcing, course structure, and open-source contribution culture may all differ from the North American and European settings most existing studies draw on.</w:t>
+        <w:t xml:space="preserve">Software engineering education research and common practitioner belief both assume that code written for a course assignment or a thesis project carries more technical debt [1] — higher complexity, near-zero test coverage, more duplicated code — than comparable work produced outside an academic setting. This assumption motivates a large share of software-engineering curriculum design, yet it is rarely tested with a matched, quantitative comparison, and to our knowledge no such comparison has been run specifically for Latin American academic software, where institutional resourcing, course structure, and open-source contribution culture may all differ from the North American and European settings most existing studies draw on.</w:t>
       </w:r>
     </w:p>
     <w:p>
@@ -182,7 +182,7 @@
           <w:sz w:val="22"/>
           <w:szCs w:val="22"/>
         </w:rPr>
-        <w:t xml:space="preserve">Santos et al. (2017) conduct a systematic literature review of external object-oriented quality metrics, cataloguing coupling, cohesion, and complexity as the dominant attributes used to characterize code quality empirically — the same three families of metric this paper applies directly to a labeled academic/non-academic comparison, rather than reviewing how others have used them. More directly relevant, Hamer et al. (2021) use Git-derived metrics to measure students' and teams' code-contribution patterns within university software-development courses, demonstrating that repository-level metrics can meaningfully characterize academic software engineering practice at scale; our study extends this direction from process metrics (who contributed what) to product metrics (what the resulting code looks like structurally), and from within-course comparisons to a labeled comparison against non-academic repositories. Mateos et al. (2017) apply the same Chidamber and Kemerer (1994) object-oriented metric suite this paper uses, in their case to relate service-interface complexity to the underlying object-oriented implementation; their use of CK metrics as an early, development-time complexity signal is consistent with how this paper treats complexity metrics generally — as a proxy available before a system reaches production rather than as an after-the-fact quality judgment.</w:t>
+        <w:t xml:space="preserve">Santos et al. [2] conduct a systematic literature review of external object-oriented quality metrics, cataloguing coupling, cohesion, and complexity as the dominant attributes used to characterize code quality empirically — the same three families of metric this paper applies directly to a labeled academic/non-academic comparison, rather than reviewing how others have used them. More directly relevant, Hamer et al. [3] use Git-derived metrics to measure students' and teams' code-contribution patterns within university software-development courses, demonstrating that repository-level metrics can meaningfully characterize academic software engineering practice at scale; our study extends this direction from process metrics (who contributed what) to product metrics (what the resulting code looks like structurally), and from within-course comparisons to a labeled comparison against non-academic repositories. Mateos et al. [4] apply the same Chidamber and Kemerer [5] object-oriented metric suite this paper uses, in their case to relate service-interface complexity to the underlying object-oriented implementation; their use of CK metrics as an early, development-time complexity signal is consistent with how this paper treats complexity metrics generally — as a proxy available before a system reaches production rather than as an after-the-fact quality judgment.</w:t>
       </w:r>
     </w:p>
     <w:p>
@@ -1656,7 +1656,7 @@
           <w:sz w:val="22"/>
           <w:szCs w:val="22"/>
         </w:rPr>
-        <w:t xml:space="preserve"> for cross-language cyclomatic complexity (McCabe, 1976) and lines of code, </w:t>
+        <w:t xml:space="preserve"> for cross-language cyclomatic complexity [6] and lines of code, </w:t>
       </w:r>
       <w:r>
         <w:rPr>
@@ -1701,7 +1701,7 @@
           <w:sz w:val="22"/>
           <w:szCs w:val="22"/>
         </w:rPr>
-        <w:t xml:space="preserve"> without requiring a SonarQube server — for the Chidamber and Kemerer (1994) object-oriented metrics suite on the Java subset (coupling between objects, CBO; lack of cohesion, LCOM; depth of inheritance tree, DIT; weighted methods per class, WMC). Test coverage was not measured by executing test suites, which is infeasible across 600 arbitrary repositories without individualized build configuration; instead we report the proportion of source files that are test files by naming convention, an explicit proxy rather than measured coverage.</w:t>
+        <w:t xml:space="preserve"> without requiring a SonarQube server — for the Chidamber and Kemerer [5] object-oriented metrics suite on the Java subset (coupling between objects, CBO; lack of cohesion, LCOM; depth of inheritance tree, DIT; weighted methods per class, WMC). Test coverage was not measured by executing test suites, which is infeasible across 600 arbitrary repositories without individualized build configuration; instead we report the proportion of source files that are test files by naming convention, an explicit proxy rather than measured coverage.</w:t>
       </w:r>
     </w:p>
     <w:p>
@@ -1836,7 +1836,7 @@
           <w:sz w:val="22"/>
           <w:szCs w:val="22"/>
         </w:rPr>
-        <w:t xml:space="preserve">Because software metrics are typically strongly right-skewed, we compare groups with the Mann-Whitney U test on each of nine metrics, apply the Holm correction for multiple comparisons, and report Cliff's delta (Cliff, 1993) as a non-parametric effect size, following standard practice for this kind of comparison in the empirical software engineering literature.</w:t>
+        <w:t xml:space="preserve">Because software metrics are typically strongly right-skewed, we compare groups with the Mann-Whitney U test on each of nine metrics, apply the Holm correction for multiple comparisons, and report Cliff's delta [7] as a non-parametric effect size, following standard practice for this kind of comparison in the empirical software engineering literature.</w:t>
       </w:r>
     </w:p>
     <w:p>
@@ -4665,7 +4665,7 @@
           <w:sz w:val="22"/>
           <w:szCs w:val="22"/>
         </w:rPr>
-        <w:t xml:space="preserve">The keyword-plus-contributor-location heuristic used to identify academic repositories is imperfect and can admit false positives (a repository containing the word “tesis” in an unrelated context) or miss true academic repositories that do not use any of the searched terms; we did not attempt manual verification at scale. More generally, GitHub-mining studies are known to over-represent personal, inactive, and non-engineered projects unless explicitly filtered (Kalliamvakou et al., 2014; Munaiah et al., 2017); our size threshold, minimum-commit filter, and (for the academic sample) contributor-location verification each narrow the sample somewhat in this direction, but we did not apply a dedicated engineered-project classifier, so some informal or abandoned repositories likely remain in both groups. The heuristic also identifies only GitHub repositories, excluding GitLab, institutional repositories, and any academic work never pushed to a public host at all — a substantial and likely non-random exclusion, since the most informal, least-polished student work is probably the least likely to be published publicly in the first place. As discussed above, the control group's size-matching means it should not be read as representative of professional software in general. Test coverage is a naming-convention proxy, not measured execution coverage. </w:t>
+        <w:t xml:space="preserve">The keyword-plus-contributor-location heuristic used to identify academic repositories is imperfect and can admit false positives (a repository containing the word “tesis” in an unrelated context) or miss true academic repositories that do not use any of the searched terms; we did not attempt manual verification at scale. More generally, GitHub-mining studies are known to over-represent personal, inactive, and non-engineered projects unless explicitly filtered [8, 9]; our size threshold, minimum-commit filter, and (for the academic sample) contributor-location verification each narrow the sample somewhat in this direction, but we did not apply a dedicated engineered-project classifier, so some informal or abandoned repositories likely remain in both groups. The heuristic also identifies only GitHub repositories, excluding GitLab, institutional repositories, and any academic work never pushed to a public host at all — a substantial and likely non-random exclusion, since the most informal, least-polished student work is probably the least likely to be published publicly in the first place. As discussed above, the control group's size-matching means it should not be read as representative of professional software in general. Test coverage is a naming-convention proxy, not measured execution coverage. </w:t>
       </w:r>
       <w:r>
         <w:rPr>
@@ -4833,7 +4833,7 @@
           <w:sz w:val="20"/>
           <w:szCs w:val="20"/>
         </w:rPr>
-        <w:t xml:space="preserve">Chidamber, S. R., &amp; Kemerer, C. F. (1994). A Metrics Suite for Object Oriented Design. IEEE Transactions on Software Engineering, 20(6), 476–493. https://doi.org/10.1109/32.295895</w:t>
+        <w:t xml:space="preserve">[1] Cunningham, W. (1992). The WyCash Portfolio Management System. OOPSLA'92 Experience Report, Addendum to the Proceedings.</w:t>
       </w:r>
     </w:p>
     <w:p>
@@ -4846,7 +4846,7 @@
           <w:sz w:val="20"/>
           <w:szCs w:val="20"/>
         </w:rPr>
-        <w:t xml:space="preserve">Cliff, N. (1993). Dominance Statistics: Ordinal Analyses to Answer Ordinal Questions. Psychological Bulletin, 114(3), 494–509.</w:t>
+        <w:t xml:space="preserve">[2] Santos, D., Resende, A., Afonso Junior, P., &amp; Costa, H. (2017). External Quality Metrics for Object-Oriented Software: A Systematic Literature Review. CLEI Electronic Journal, 20(3). https://doi.org/10.19153/cleiej.20.3.3</w:t>
       </w:r>
     </w:p>
     <w:p>
@@ -4859,7 +4859,7 @@
           <w:sz w:val="20"/>
           <w:szCs w:val="20"/>
         </w:rPr>
-        <w:t xml:space="preserve">Cunningham, W. (1992). The WyCash Portfolio Management System. OOPSLA'92 Experience Report, Addendum to the Proceedings.</w:t>
+        <w:t xml:space="preserve">[3] Hamer, S., Quesada-López, C., Martínez, A., &amp; Jenkins, M. (2021). Using Git Metrics to Measure Students' and Teams' Code Contributions in Software Development Projects. CLEI Electronic Journal, 24(2). https://doi.org/10.19153/cleiej.24.2.8</w:t>
       </w:r>
     </w:p>
     <w:p>
@@ -4872,7 +4872,7 @@
           <w:sz w:val="20"/>
           <w:szCs w:val="20"/>
         </w:rPr>
-        <w:t xml:space="preserve">Hamer, S., Quesada-López, C., Martínez, A., &amp; Jenkins, M. (2021). Using Git Metrics to Measure Students' and Teams' Code Contributions in Software Development Projects. CLEI Electronic Journal, 24(2). https://doi.org/10.19153/cleiej.24.2.8</w:t>
+        <w:t xml:space="preserve">[4] Mateos, C., Zunino, A., Misra, S., Anabalón, D., &amp; Flores, A. (2017). Managing Web Service Interface Complexity via an OO Metric-based Early Approach. CLEI Electronic Journal, 20(3). https://doi.org/10.19153/cleiej.20.3.2</w:t>
       </w:r>
     </w:p>
     <w:p>
@@ -4885,7 +4885,7 @@
           <w:sz w:val="20"/>
           <w:szCs w:val="20"/>
         </w:rPr>
-        <w:t xml:space="preserve">Kalliamvakou, E., Gousios, G., Blincoe, K., Singer, L., German, D. M., &amp; Damian, D. (2014). The Promises and Perils of Mining GitHub. Proceedings of the 11th Working Conference on Mining Software Repositories (MSR), 92–101. https://doi.org/10.1145/2597073.2597074</w:t>
+        <w:t xml:space="preserve">[5] Chidamber, S. R., &amp; Kemerer, C. F. (1994). A Metrics Suite for Object Oriented Design. IEEE Transactions on Software Engineering, 20(6), 476–493. https://doi.org/10.1109/32.295895</w:t>
       </w:r>
     </w:p>
     <w:p>
@@ -4898,7 +4898,7 @@
           <w:sz w:val="20"/>
           <w:szCs w:val="20"/>
         </w:rPr>
-        <w:t xml:space="preserve">Mateos, C., Zunino, A., Misra, S., Anabalón, D., &amp; Flores, A. (2017). Managing Web Service Interface Complexity via an OO Metric-based Early Approach. CLEI Electronic Journal, 20(3). https://doi.org/10.19153/cleiej.20.3.2</w:t>
+        <w:t xml:space="preserve">[6] McCabe, T. J. (1976). A Complexity Measure. IEEE Transactions on Software Engineering, SE-2(4), 308–320.</w:t>
       </w:r>
     </w:p>
     <w:p>
@@ -4911,7 +4911,7 @@
           <w:sz w:val="20"/>
           <w:szCs w:val="20"/>
         </w:rPr>
-        <w:t xml:space="preserve">McCabe, T. J. (1976). A Complexity Measure. IEEE Transactions on Software Engineering, SE-2(4), 308–320.</w:t>
+        <w:t xml:space="preserve">[7] Cliff, N. (1993). Dominance Statistics: Ordinal Analyses to Answer Ordinal Questions. Psychological Bulletin, 114(3), 494–509.</w:t>
       </w:r>
     </w:p>
     <w:p>
@@ -4924,7 +4924,7 @@
           <w:sz w:val="20"/>
           <w:szCs w:val="20"/>
         </w:rPr>
-        <w:t xml:space="preserve">Munaiah, N., Kroh, S., Cabrey, C., &amp; Nagappan, M. (2017). Curating GitHub for Engineered Software Projects. Empirical Software Engineering, 22(6), 3219–3253. https://doi.org/10.1007/s10664-017-9512-6</w:t>
+        <w:t xml:space="preserve">[8] Kalliamvakou, E., Gousios, G., Blincoe, K., Singer, L., German, D. M., &amp; Damian, D. (2014). The Promises and Perils of Mining GitHub. Proceedings of the 11th Working Conference on Mining Software Repositories (MSR), 92–101. https://doi.org/10.1145/2597073.2597074</w:t>
       </w:r>
     </w:p>
     <w:p>
@@ -4937,7 +4937,7 @@
           <w:sz w:val="20"/>
           <w:szCs w:val="20"/>
         </w:rPr>
-        <w:t xml:space="preserve">Santos, D., Resende, A., Afonso Junior, P., &amp; Costa, H. (2017). External Quality Metrics for Object-Oriented Software: A Systematic Literature Review. CLEI Electronic Journal, 20(3). https://doi.org/10.19153/cleiej.20.3.3</w:t>
+        <w:t xml:space="preserve">[9] Munaiah, N., Kroh, S., Cabrey, C., &amp; Nagappan, M. (2017). Curating GitHub for Engineered Software Projects. Empirical Software Engineering, 22(6), 3219–3253. https://doi.org/10.1007/s10664-017-9512-6</w:t>
       </w:r>
     </w:p>
     <w:sectPr>

</xml_diff>

<commit_message>
chore: sync Word/PDF with the jscpd threshold-isolation finding
</commit_message>
<xml_diff>
--- a/paper/P9_CLEIej_manuscript.docx
+++ b/paper/P9_CLEIej_manuscript.docx
@@ -4614,7 +4614,7 @@
           <w:sz w:val="22"/>
           <w:szCs w:val="22"/>
         </w:rPr>
-        <w:t xml:space="preserve"> (null) and SonarQube's detector (small, significant, and in the direction the original hypothesis expected) remains unresolved. The two tools use different default block-matching thresholds (</w:t>
+        <w:t xml:space="preserve"> (null, default settings) and SonarQube's detector (small, significant, and in the direction the original hypothesis expected) is at least partly explained by the two tools' different default block-matching thresholds. We isolated this factor directly: re-running </w:t>
       </w:r>
       <w:r>
         <w:rPr>
@@ -4629,7 +4629,7 @@
           <w:sz w:val="22"/>
           <w:szCs w:val="22"/>
         </w:rPr>
-        <w:t xml:space="preserve">'s default minimum is on the order of 50 tokens; SonarQube's Java duplication detector generally requires larger blocks, roughly 100 tokens or 10 lines) and were run on different, only partially overlapping samples (549 repositories for </w:t>
+        <w:t xml:space="preserve"> with </w:t>
       </w:r>
       <w:r>
         <w:rPr>
@@ -4637,6 +4637,21 @@
           <w:sz w:val="22"/>
           <w:szCs w:val="22"/>
         </w:rPr>
+        <w:t xml:space="preserve">--min-tokens 100</w:t>
+      </w:r>
+      <w:r>
+        <w:rPr>
+          <w:sz w:val="22"/>
+          <w:szCs w:val="22"/>
+        </w:rPr>
+        <w:t xml:space="preserve"> (approximating SonarQube's typical Java threshold of roughly 100 tokens or 10 lines) on the identical 415-repository sub-sample used for the SonarQube comparison, holding the sample fixed so only the threshold changes, reverses the null result. At the higher threshold, </w:t>
+      </w:r>
+      <w:r>
+        <w:rPr>
+          <w:rFonts w:ascii="Courier New" w:cs="Courier New" w:eastAsia="Courier New" w:hAnsi="Courier New"/>
+          <w:sz w:val="22"/>
+          <w:szCs w:val="22"/>
+        </w:rPr>
         <w:t xml:space="preserve">jscpd</w:t>
       </w:r>
       <w:r>
@@ -4644,7 +4659,36 @@
           <w:sz w:val="22"/>
           <w:szCs w:val="22"/>
         </w:rPr>
-        <w:t xml:space="preserve"> versus 415 for SonarQube), so neither the direction nor the reported magnitude of the discrepancy can be attributed to a specific mechanism without further work that isolates sample and threshold as separate factors. We report both results rather than adjudicate between them.</w:t>
+        <w:t xml:space="preserve"> finds significantly </w:t>
+      </w:r>
+      <w:r>
+        <w:rPr>
+          <w:sz w:val="22"/>
+          <w:szCs w:val="22"/>
+        </w:rPr>
+        <w:t xml:space="preserve">higher</w:t>
+      </w:r>
+      <w:r>
+        <w:rPr>
+          <w:sz w:val="22"/>
+          <w:szCs w:val="22"/>
+        </w:rPr>
+        <w:t xml:space="preserve"> duplication in academic code (median 1.77% vs. 1.10%, Cliff's δ = +0.122, small effect, p = 0.031), the same direction SonarQube reports, rather than the null result </w:t>
+      </w:r>
+      <w:r>
+        <w:rPr>
+          <w:rFonts w:ascii="Courier New" w:cs="Courier New" w:eastAsia="Courier New" w:hAnsi="Courier New"/>
+          <w:sz w:val="22"/>
+          <w:szCs w:val="22"/>
+        </w:rPr>
+        <w:t xml:space="preserve">jscpd</w:t>
+      </w:r>
+      <w:r>
+        <w:rPr>
+          <w:sz w:val="22"/>
+          <w:szCs w:val="22"/>
+        </w:rPr>
+        <w:t xml:space="preserve"> gives at its own default (roughly 50 tokens) on the larger 549-repository sample. This does not fully resolve the discrepancy, since the effect size at the matched threshold (δ = 0.122) is still smaller than SonarQube's (δ = 0.181) and the sample-size factor remains conflated with the original default-threshold null result, but it shows the threshold is a real, non-trivial contributor: a more permissive duplicate-detection threshold on the same tool, same sample, changes both the significance and the direction of the finding.</w:t>
       </w:r>
     </w:p>
     <w:p>
@@ -4745,7 +4789,22 @@
           <w:sz w:val="22"/>
           <w:szCs w:val="22"/>
         </w:rPr>
-        <w:t xml:space="preserve"> cyclomatic complexity than the control group — the opposite of our initial hypothesis — while showing significantly deeper inheritance hierarchies, as hypothesized. Coupling, cohesion, duplication, and a test-coverage proxy show no significant difference after correction, and testing is near-absent in both groups rather than distinctively academic. We attribute the inverted complexity result chiefly to the composition of the size-matched control group, which is itself drawn from small, often informal repositories rather than mature open-source software, and recommend that future comparative studies of academic code quality either use a professionally curated control set or explicitly frame their comparison as academic-versus-small-repository rather than academic-versus-professional. A follow-up check with SonarQube Community itself, run without Docker on a 415-repository sub-sample after our original tool substitution, reproduces the direction of the lower-complexity finding using SonarQube's own complexity metric and shows academic code has a lower SonarQube technical-debt ratio; because SonarQube and our primary tool compute the same underlying cyclomatic-complexity construct, we treat this as a cross-tool consistency check rather than an independent replication, and the one clear point of disagreement across tools, duplication rate, is reported as an open, tool-dependent discrepancy rather than resolved in either direction. On the same sub-sample, a self-admitted technical debt (SATD) comment count runs in the direction the original hypothesis expected, unlike the structural metrics: academic repositories more often contain explicit </w:t>
+        <w:t xml:space="preserve"> cyclomatic complexity than the control group — the opposite of our initial hypothesis — while showing significantly deeper inheritance hierarchies, as hypothesized. Coupling, cohesion, duplication, and a test-coverage proxy show no significant difference after correction, and testing is near-absent in both groups rather than distinctively academic. We attribute the inverted complexity result chiefly to the composition of the size-matched control group, which is itself drawn from small, often informal repositories rather than mature open-source software, and recommend that future comparative studies of academic code quality either use a professionally curated control set or explicitly frame their comparison as academic-versus-small-repository rather than academic-versus-professional. A follow-up check with SonarQube Community itself, run without Docker on a 415-repository sub-sample after our original tool substitution, reproduces the direction of the lower-complexity finding using SonarQube's own complexity metric and shows academic code has a lower SonarQube technical-debt ratio; because SonarQube and our primary tool compute the same underlying cyclomatic-complexity construct, we treat this as a cross-tool consistency check rather than an independent replication, and the one clear point of disagreement across tools, duplication rate, is partly explained by the tools' different duplicate-detection thresholds: re-running </w:t>
+      </w:r>
+      <w:r>
+        <w:rPr>
+          <w:rFonts w:ascii="Courier New" w:cs="Courier New" w:eastAsia="Courier New" w:hAnsi="Courier New"/>
+          <w:sz w:val="22"/>
+          <w:szCs w:val="22"/>
+        </w:rPr>
+        <w:t xml:space="preserve">jscpd</w:t>
+      </w:r>
+      <w:r>
+        <w:rPr>
+          <w:sz w:val="22"/>
+          <w:szCs w:val="22"/>
+        </w:rPr>
+        <w:t xml:space="preserve"> with a SonarQube-matched threshold on the same 415-repository sub-sample reverses its null result to agree with SonarQube's direction (academic higher), though a smaller effect size than SonarQube's own, so the discrepancy is narrowed rather than fully resolved. On the same sub-sample, a self-admitted technical debt (SATD) comment count runs in the direction the original hypothesis expected, unlike the structural metrics: academic repositories more often contain explicit </w:t>
       </w:r>
       <w:r>
         <w:rPr>

</xml_diff>